<commit_message>
v9.53: package Waves 1–5 build + refresh registry audit
Repackaged runnable build QueryBook-v9.53-2026-10-02.zip with all five waves
(no secrets/local state). Refreshed the registry audit to reflect the new
backends: Included rose 29 → 68, Missing fell 150 → 120 (30 features promoted
across LIL, PIL, query understanding, response ranking, ontology, assessment,
rights, UIAS, provenance lineage, webhooks).

docs/QueryBook-Prototype-Registry-Audit.xlsx and
docs/QueryBook-Prototype-Registry-Checklist.docx regenerated (v9.53 label).

Co-Authored-By: Claude Opus 4.8 <noreply@anthropic.com>
Claude-Session: https://claude.ai/code/session_019szkZU7hLaBcGBEqVSVWY6
</commit_message>
<xml_diff>
--- a/docs/QueryBook-Prototype-Registry-Checklist.docx
+++ b/docs/QueryBook-Prototype-Registry-Checklist.docx
@@ -23,7 +23,7 @@
         <w:t xml:space="preserve">Prototype:</w:t>
       </w:r>
       <w:r>
-        <w:t xml:space="preserve"> QueryBook v9.51  ·  </w:t>
+        <w:t xml:space="preserve"> QueryBook v9.53  ·  </w:t>
       </w:r>
       <w:r>
         <w:rPr>
@@ -236,7 +236,7 @@
               <w:spacing w:after="0"/>
             </w:pPr>
             <w:r>
-              <w:t xml:space="preserve">29</w:t>
+              <w:t xml:space="preserve">68</w:t>
             </w:r>
           </w:p>
         </w:tc>
@@ -255,7 +255,7 @@
               <w:spacing w:after="0"/>
             </w:pPr>
             <w:r>
-              <w:t xml:space="preserve">13.2%</w:t>
+              <w:t xml:space="preserve">31.1%</w:t>
             </w:r>
           </w:p>
         </w:tc>
@@ -314,7 +314,7 @@
               <w:spacing w:after="0"/>
             </w:pPr>
             <w:r>
-              <w:t xml:space="preserve">40</w:t>
+              <w:t xml:space="preserve">31</w:t>
             </w:r>
           </w:p>
         </w:tc>
@@ -333,7 +333,7 @@
               <w:spacing w:after="0"/>
             </w:pPr>
             <w:r>
-              <w:t xml:space="preserve">18.3%</w:t>
+              <w:t xml:space="preserve">14.2%</w:t>
             </w:r>
           </w:p>
         </w:tc>
@@ -392,7 +392,7 @@
               <w:spacing w:after="0"/>
             </w:pPr>
             <w:r>
-              <w:t xml:space="preserve">150</w:t>
+              <w:t xml:space="preserve">120</w:t>
             </w:r>
           </w:p>
         </w:tc>
@@ -411,7 +411,7 @@
               <w:spacing w:after="0"/>
             </w:pPr>
             <w:r>
-              <w:t xml:space="preserve">68.5%</w:t>
+              <w:t xml:space="preserve">54.8%</w:t>
             </w:r>
           </w:p>
         </w:tc>
@@ -524,7 +524,7 @@
           <w:b/>
           <w:bCs/>
         </w:rPr>
-        <w:t xml:space="preserve">fully supports 29</w:t>
+        <w:t xml:space="preserve">fully supports 68</w:t>
       </w:r>
       <w:r>
         <w:t xml:space="preserve"> features and </w:t>
@@ -534,17 +534,17 @@
           <w:b/>
           <w:bCs/>
         </w:rPr>
-        <w:t xml:space="preserve">partially supports 40</w:t>
-      </w:r>
-      <w:r>
-        <w:t xml:space="preserve"> (= 69 of 219, 32% touched); </w:t>
-      </w:r>
-      <w:r>
-        <w:rPr>
-          <w:b/>
-          <w:bCs/>
-        </w:rPr>
-        <w:t xml:space="preserve">150 do not exist</w:t>
+        <w:t xml:space="preserve">partially supports 31</w:t>
+      </w:r>
+      <w:r>
+        <w:t xml:space="preserve"> (= 99 of 219, 45% touched); </w:t>
+      </w:r>
+      <w:r>
+        <w:rPr>
+          <w:b/>
+          <w:bCs/>
+        </w:rPr>
+        <w:t xml:space="preserve">120 do not exist</w:t>
       </w:r>
       <w:r>
         <w:t xml:space="preserve"> yet.</w:t>
@@ -1926,20 +1926,20 @@
         <w:spacing w:after="90" w:before="220"/>
       </w:pPr>
       <w:r>
-        <w:t xml:space="preserve">4. Query Understanding  (☑ 2 · ◐ 6 · ☐ 1 of 9)</w:t>
-      </w:r>
-    </w:p>
-    <w:p>
-      <w:pPr>
-        <w:pStyle w:val="ListParagraph"/>
-        <w:numPr>
-          <w:ilvl w:val="0"/>
-          <w:numId w:val="1"/>
-        </w:numPr>
-        <w:spacing w:after="40"/>
-      </w:pPr>
-      <w:r>
-        <w:t xml:space="preserve">◐ </w:t>
+        <w:t xml:space="preserve">4. Query Understanding  (☑ 7 · ◐ 1 · ☐ 1 of 9)</w:t>
+      </w:r>
+    </w:p>
+    <w:p>
+      <w:pPr>
+        <w:pStyle w:val="ListParagraph"/>
+        <w:numPr>
+          <w:ilvl w:val="0"/>
+          <w:numId w:val="1"/>
+        </w:numPr>
+        <w:spacing w:after="40"/>
+      </w:pPr>
+      <w:r>
+        <w:t xml:space="preserve">☑ </w:t>
       </w:r>
       <w:r>
         <w:rPr>
@@ -1949,20 +1949,20 @@
         <w:t xml:space="preserve">[059] 8.4.2 — Entity Resolution Engine</w:t>
       </w:r>
       <w:r>
-        <w:t xml:space="preserve"> — Partial — _qb_chat.retrieve/plan_queries_ Entities are matched during retrieval; no standalone resolver.</w:t>
-      </w:r>
-    </w:p>
-    <w:p>
-      <w:pPr>
-        <w:pStyle w:val="ListParagraph"/>
-        <w:numPr>
-          <w:ilvl w:val="0"/>
-          <w:numId w:val="1"/>
-        </w:numPr>
-        <w:spacing w:after="40"/>
-      </w:pPr>
-      <w:r>
-        <w:t xml:space="preserve">◐ </w:t>
+        <w:t xml:space="preserve"> — Included — _qb_query.entities_ Deterministic entity extraction.</w:t>
+      </w:r>
+    </w:p>
+    <w:p>
+      <w:pPr>
+        <w:pStyle w:val="ListParagraph"/>
+        <w:numPr>
+          <w:ilvl w:val="0"/>
+          <w:numId w:val="1"/>
+        </w:numPr>
+        <w:spacing w:after="40"/>
+      </w:pPr>
+      <w:r>
+        <w:t xml:space="preserve">☑ </w:t>
       </w:r>
       <w:r>
         <w:rPr>
@@ -1972,20 +1972,20 @@
         <w:t xml:space="preserve">[060] 8.4.3 — Predicate Resolution</w:t>
       </w:r>
       <w:r>
-        <w:t xml:space="preserve"> — Partial — _ufcs_store.fql (predicate match)_ Predicates are modeled and matched in FQL.</w:t>
-      </w:r>
-    </w:p>
-    <w:p>
-      <w:pPr>
-        <w:pStyle w:val="ListParagraph"/>
-        <w:numPr>
-          <w:ilvl w:val="0"/>
-          <w:numId w:val="1"/>
-        </w:numPr>
-        <w:spacing w:after="40"/>
-      </w:pPr>
-      <w:r>
-        <w:t xml:space="preserve">◐ </w:t>
+        <w:t xml:space="preserve"> — Included — _qb_query.predicate_ Predicate resolution via cue table + FQL.</w:t>
+      </w:r>
+    </w:p>
+    <w:p>
+      <w:pPr>
+        <w:pStyle w:val="ListParagraph"/>
+        <w:numPr>
+          <w:ilvl w:val="0"/>
+          <w:numId w:val="1"/>
+        </w:numPr>
+        <w:spacing w:after="40"/>
+      </w:pPr>
+      <w:r>
+        <w:t xml:space="preserve">☑ </w:t>
       </w:r>
       <w:r>
         <w:rPr>
@@ -1995,7 +1995,7 @@
         <w:t xml:space="preserve">[061] 8.4.4 — Intent Classification Engine</w:t>
       </w:r>
       <w:r>
-        <w:t xml:space="preserve"> — Partial — _qb_chat.plan_queries/gate_ Query intent is planned in the chat pipeline.</w:t>
+        <w:t xml:space="preserve"> — Included — _qb_query.intent_ Intent classification (question/command/statement).</w:t>
       </w:r>
     </w:p>
     <w:p>
@@ -2031,7 +2031,7 @@
         <w:spacing w:after="40"/>
       </w:pPr>
       <w:r>
-        <w:t xml:space="preserve">◐ </w:t>
+        <w:t xml:space="preserve">☑ </w:t>
       </w:r>
       <w:r>
         <w:rPr>
@@ -2041,7 +2041,7 @@
         <w:t xml:space="preserve">[063] 8.4.6 — Scope Detection Engine</w:t>
       </w:r>
       <w:r>
-        <w:t xml:space="preserve"> — Partial — _/api/domains, /api/domain_logic_ Domain scoping exists; not a full scope-detection engine.</w:t>
+        <w:t xml:space="preserve"> — Included — _qb_query.understand (scope)_ Scope set in the query plan.</w:t>
       </w:r>
     </w:p>
     <w:p>
@@ -2077,7 +2077,7 @@
         <w:spacing w:after="40"/>
       </w:pPr>
       <w:r>
-        <w:t xml:space="preserve">◐ </w:t>
+        <w:t xml:space="preserve">☑ </w:t>
       </w:r>
       <w:r>
         <w:rPr>
@@ -2087,7 +2087,7 @@
         <w:t xml:space="preserve">[065] 8.4.8 — Query Expansion Engine</w:t>
       </w:r>
       <w:r>
-        <w:t xml:space="preserve"> — Partial — _qb_chat.plan_queries_ The planner expands a question into multiple store queries.</w:t>
+        <w:t xml:space="preserve"> — Included — _qb_query.expand_ Deterministic query expansion.</w:t>
       </w:r>
     </w:p>
     <w:p>
@@ -2142,20 +2142,20 @@
         <w:spacing w:after="90" w:before="220"/>
       </w:pPr>
       <w:r>
-        <w:t xml:space="preserve">5. Ontology / Concept Graph  (☑ 0 · ◐ 0 · ☐ 13 of 13)</w:t>
-      </w:r>
-    </w:p>
-    <w:p>
-      <w:pPr>
-        <w:pStyle w:val="ListParagraph"/>
-        <w:numPr>
-          <w:ilvl w:val="0"/>
-          <w:numId w:val="1"/>
-        </w:numPr>
-        <w:spacing w:after="40"/>
-      </w:pPr>
-      <w:r>
-        <w:t xml:space="preserve">☐ </w:t>
+        <w:t xml:space="preserve">5. Ontology / Concept Graph  (☑ 6 · ◐ 0 · ☐ 7 of 13)</w:t>
+      </w:r>
+    </w:p>
+    <w:p>
+      <w:pPr>
+        <w:pStyle w:val="ListParagraph"/>
+        <w:numPr>
+          <w:ilvl w:val="0"/>
+          <w:numId w:val="1"/>
+        </w:numPr>
+        <w:spacing w:after="40"/>
+      </w:pPr>
+      <w:r>
+        <w:t xml:space="preserve">☑ </w:t>
       </w:r>
       <w:r>
         <w:rPr>
@@ -2165,20 +2165,20 @@
         <w:t xml:space="preserve">[068] 8.5.1 — Ontology Directed Acyclic</w:t>
       </w:r>
       <w:r>
-        <w:t xml:space="preserve"> — Missing No ontology DAG / concept-node / edge subsystem in the prototype.</w:t>
-      </w:r>
-    </w:p>
-    <w:p>
-      <w:pPr>
-        <w:pStyle w:val="ListParagraph"/>
-        <w:numPr>
-          <w:ilvl w:val="0"/>
-          <w:numId w:val="1"/>
-        </w:numPr>
-        <w:spacing w:after="40"/>
-      </w:pPr>
-      <w:r>
-        <w:t xml:space="preserve">☐ </w:t>
+        <w:t xml:space="preserve"> — Included — _qb_ontology.build_ Concept graph (DAG-style) from Fact-Unit triples.</w:t>
+      </w:r>
+    </w:p>
+    <w:p>
+      <w:pPr>
+        <w:pStyle w:val="ListParagraph"/>
+        <w:numPr>
+          <w:ilvl w:val="0"/>
+          <w:numId w:val="1"/>
+        </w:numPr>
+        <w:spacing w:after="40"/>
+      </w:pPr>
+      <w:r>
+        <w:t xml:space="preserve">☑ </w:t>
       </w:r>
       <w:r>
         <w:rPr>
@@ -2188,20 +2188,20 @@
         <w:t xml:space="preserve">[069] 8.5.2 — Concept Nodes</w:t>
       </w:r>
       <w:r>
-        <w:t xml:space="preserve"> — Missing No ontology DAG / concept-node / edge subsystem in the prototype.</w:t>
-      </w:r>
-    </w:p>
-    <w:p>
-      <w:pPr>
-        <w:pStyle w:val="ListParagraph"/>
-        <w:numPr>
-          <w:ilvl w:val="0"/>
-          <w:numId w:val="1"/>
-        </w:numPr>
-        <w:spacing w:after="40"/>
-      </w:pPr>
-      <w:r>
-        <w:t xml:space="preserve">☐ </w:t>
+        <w:t xml:space="preserve"> — Included — _qb_ontology (nodes)_ Concept nodes.</w:t>
+      </w:r>
+    </w:p>
+    <w:p>
+      <w:pPr>
+        <w:pStyle w:val="ListParagraph"/>
+        <w:numPr>
+          <w:ilvl w:val="0"/>
+          <w:numId w:val="1"/>
+        </w:numPr>
+        <w:spacing w:after="40"/>
+      </w:pPr>
+      <w:r>
+        <w:t xml:space="preserve">☑ </w:t>
       </w:r>
       <w:r>
         <w:rPr>
@@ -2211,20 +2211,20 @@
         <w:t xml:space="preserve">[070] 8.5.3 — Hierarchical Edges</w:t>
       </w:r>
       <w:r>
-        <w:t xml:space="preserve"> — Missing No ontology DAG / concept-node / edge subsystem in the prototype.</w:t>
-      </w:r>
-    </w:p>
-    <w:p>
-      <w:pPr>
-        <w:pStyle w:val="ListParagraph"/>
-        <w:numPr>
-          <w:ilvl w:val="0"/>
-          <w:numId w:val="1"/>
-        </w:numPr>
-        <w:spacing w:after="40"/>
-      </w:pPr>
-      <w:r>
-        <w:t xml:space="preserve">☐ </w:t>
+        <w:t xml:space="preserve"> — Included — _qb_ontology (hierarchical edges)_ Hierarchical edges.</w:t>
+      </w:r>
+    </w:p>
+    <w:p>
+      <w:pPr>
+        <w:pStyle w:val="ListParagraph"/>
+        <w:numPr>
+          <w:ilvl w:val="0"/>
+          <w:numId w:val="1"/>
+        </w:numPr>
+        <w:spacing w:after="40"/>
+      </w:pPr>
+      <w:r>
+        <w:t xml:space="preserve">☑ </w:t>
       </w:r>
       <w:r>
         <w:rPr>
@@ -2234,20 +2234,20 @@
         <w:t xml:space="preserve">[071] 8.5.4 — Prerequisite Edges</w:t>
       </w:r>
       <w:r>
-        <w:t xml:space="preserve"> — Missing No ontology DAG / concept-node / edge subsystem in the prototype.</w:t>
-      </w:r>
-    </w:p>
-    <w:p>
-      <w:pPr>
-        <w:pStyle w:val="ListParagraph"/>
-        <w:numPr>
-          <w:ilvl w:val="0"/>
-          <w:numId w:val="1"/>
-        </w:numPr>
-        <w:spacing w:after="40"/>
-      </w:pPr>
-      <w:r>
-        <w:t xml:space="preserve">☐ </w:t>
+        <w:t xml:space="preserve"> — Included — _qb_ontology (prerequisite edges)_ Prerequisite edges.</w:t>
+      </w:r>
+    </w:p>
+    <w:p>
+      <w:pPr>
+        <w:pStyle w:val="ListParagraph"/>
+        <w:numPr>
+          <w:ilvl w:val="0"/>
+          <w:numId w:val="1"/>
+        </w:numPr>
+        <w:spacing w:after="40"/>
+      </w:pPr>
+      <w:r>
+        <w:t xml:space="preserve">☑ </w:t>
       </w:r>
       <w:r>
         <w:rPr>
@@ -2257,20 +2257,20 @@
         <w:t xml:space="preserve">[072] 8.5.5 — Equivalence Edges</w:t>
       </w:r>
       <w:r>
-        <w:t xml:space="preserve"> — Missing No ontology DAG / concept-node / edge subsystem in the prototype.</w:t>
-      </w:r>
-    </w:p>
-    <w:p>
-      <w:pPr>
-        <w:pStyle w:val="ListParagraph"/>
-        <w:numPr>
-          <w:ilvl w:val="0"/>
-          <w:numId w:val="1"/>
-        </w:numPr>
-        <w:spacing w:after="40"/>
-      </w:pPr>
-      <w:r>
-        <w:t xml:space="preserve">☐ </w:t>
+        <w:t xml:space="preserve"> — Included — _qb_ontology (equivalence edges)_ Equivalence edges.</w:t>
+      </w:r>
+    </w:p>
+    <w:p>
+      <w:pPr>
+        <w:pStyle w:val="ListParagraph"/>
+        <w:numPr>
+          <w:ilvl w:val="0"/>
+          <w:numId w:val="1"/>
+        </w:numPr>
+        <w:spacing w:after="40"/>
+      </w:pPr>
+      <w:r>
+        <w:t xml:space="preserve">☑ </w:t>
       </w:r>
       <w:r>
         <w:rPr>
@@ -2280,7 +2280,7 @@
         <w:t xml:space="preserve">[073] 8.5.6 — Concept Path Generator</w:t>
       </w:r>
       <w:r>
-        <w:t xml:space="preserve"> — Missing No ontology DAG / concept-node / edge subsystem in the prototype.</w:t>
+        <w:t xml:space="preserve"> — Included — _qb_ontology.concept_path_ Concept path generator (BFS).</w:t>
       </w:r>
     </w:p>
     <w:p>
@@ -2450,20 +2450,20 @@
         <w:spacing w:after="90" w:before="220"/>
       </w:pPr>
       <w:r>
-        <w:t xml:space="preserve">6. Assessment / Education  (☑ 0 · ◐ 0 · ☐ 16 of 16)</w:t>
-      </w:r>
-    </w:p>
-    <w:p>
-      <w:pPr>
-        <w:pStyle w:val="ListParagraph"/>
-        <w:numPr>
-          <w:ilvl w:val="0"/>
-          <w:numId w:val="1"/>
-        </w:numPr>
-        <w:spacing w:after="40"/>
-      </w:pPr>
-      <w:r>
-        <w:t xml:space="preserve">☐ </w:t>
+        <w:t xml:space="preserve">6. Assessment / Education  (☑ 6 · ◐ 0 · ☐ 10 of 16)</w:t>
+      </w:r>
+    </w:p>
+    <w:p>
+      <w:pPr>
+        <w:pStyle w:val="ListParagraph"/>
+        <w:numPr>
+          <w:ilvl w:val="0"/>
+          <w:numId w:val="1"/>
+        </w:numPr>
+        <w:spacing w:after="40"/>
+      </w:pPr>
+      <w:r>
+        <w:t xml:space="preserve">☑ </w:t>
       </w:r>
       <w:r>
         <w:rPr>
@@ -2473,6 +2473,75 @@
         <w:t xml:space="preserve">[081] 8.6.1 — Assessment Item</w:t>
       </w:r>
       <w:r>
+        <w:t xml:space="preserve"> — Included — _qb_assess.items_from_triples_ Assessment item generator.</w:t>
+      </w:r>
+    </w:p>
+    <w:p>
+      <w:pPr>
+        <w:pStyle w:val="ListParagraph"/>
+        <w:numPr>
+          <w:ilvl w:val="0"/>
+          <w:numId w:val="1"/>
+        </w:numPr>
+        <w:spacing w:after="40"/>
+      </w:pPr>
+      <w:r>
+        <w:t xml:space="preserve">☑ </w:t>
+      </w:r>
+      <w:r>
+        <w:rPr>
+          <w:b/>
+          <w:bCs/>
+        </w:rPr>
+        <w:t xml:space="preserve">[082] 8.6.2 — Distractor Generator</w:t>
+      </w:r>
+      <w:r>
+        <w:t xml:space="preserve"> — Included — _qb_assess (distractors)_ Same-predicate distractor generator.</w:t>
+      </w:r>
+    </w:p>
+    <w:p>
+      <w:pPr>
+        <w:pStyle w:val="ListParagraph"/>
+        <w:numPr>
+          <w:ilvl w:val="0"/>
+          <w:numId w:val="1"/>
+        </w:numPr>
+        <w:spacing w:after="40"/>
+      </w:pPr>
+      <w:r>
+        <w:t xml:space="preserve">☑ </w:t>
+      </w:r>
+      <w:r>
+        <w:rPr>
+          <w:b/>
+          <w:bCs/>
+        </w:rPr>
+        <w:t xml:space="preserve">[083] 8.6.3 — Competency Mapping</w:t>
+      </w:r>
+      <w:r>
+        <w:t xml:space="preserve"> — Included — _qb_assess (competency)_ Competency = predicate tag.</w:t>
+      </w:r>
+    </w:p>
+    <w:p>
+      <w:pPr>
+        <w:pStyle w:val="ListParagraph"/>
+        <w:numPr>
+          <w:ilvl w:val="0"/>
+          <w:numId w:val="1"/>
+        </w:numPr>
+        <w:spacing w:after="40"/>
+      </w:pPr>
+      <w:r>
+        <w:t xml:space="preserve">☐ </w:t>
+      </w:r>
+      <w:r>
+        <w:rPr>
+          <w:b/>
+          <w:bCs/>
+        </w:rPr>
+        <w:t xml:space="preserve">[084] 8.6.4 — Learning Objective</w:t>
+      </w:r>
+      <w:r>
         <w:t xml:space="preserve"> — Missing No assessment/education subsystem in the prototype.</w:t>
       </w:r>
     </w:p>
@@ -2486,14 +2555,37 @@
         <w:spacing w:after="40"/>
       </w:pPr>
       <w:r>
-        <w:t xml:space="preserve">☐ </w:t>
-      </w:r>
-      <w:r>
-        <w:rPr>
-          <w:b/>
-          <w:bCs/>
-        </w:rPr>
-        <w:t xml:space="preserve">[082] 8.6.2 — Distractor Generator</w:t>
+        <w:t xml:space="preserve">☑ </w:t>
+      </w:r>
+      <w:r>
+        <w:rPr>
+          <w:b/>
+          <w:bCs/>
+        </w:rPr>
+        <w:t xml:space="preserve">[085] 8.6.5 — Difficulty Estimation</w:t>
+      </w:r>
+      <w:r>
+        <w:t xml:space="preserve"> — Included — _qb_assess._difficulty_ Difficulty estimation.</w:t>
+      </w:r>
+    </w:p>
+    <w:p>
+      <w:pPr>
+        <w:pStyle w:val="ListParagraph"/>
+        <w:numPr>
+          <w:ilvl w:val="0"/>
+          <w:numId w:val="1"/>
+        </w:numPr>
+        <w:spacing w:after="40"/>
+      </w:pPr>
+      <w:r>
+        <w:t xml:space="preserve">☐ </w:t>
+      </w:r>
+      <w:r>
+        <w:rPr>
+          <w:b/>
+          <w:bCs/>
+        </w:rPr>
+        <w:t xml:space="preserve">[086] 8.6.6 — Error Type Classification</w:t>
       </w:r>
       <w:r>
         <w:t xml:space="preserve"> — Missing No assessment/education subsystem in the prototype.</w:t>
@@ -2516,7 +2608,7 @@
           <w:b/>
           <w:bCs/>
         </w:rPr>
-        <w:t xml:space="preserve">[083] 8.6.3 — Competency Mapping</w:t>
+        <w:t xml:space="preserve">[087] 8.6.7 — Concept Path Mastery</w:t>
       </w:r>
       <w:r>
         <w:t xml:space="preserve"> — Missing No assessment/education subsystem in the prototype.</w:t>
@@ -2532,99 +2624,7 @@
         <w:spacing w:after="40"/>
       </w:pPr>
       <w:r>
-        <w:t xml:space="preserve">☐ </w:t>
-      </w:r>
-      <w:r>
-        <w:rPr>
-          <w:b/>
-          <w:bCs/>
-        </w:rPr>
-        <w:t xml:space="preserve">[084] 8.6.4 — Learning Objective</w:t>
-      </w:r>
-      <w:r>
-        <w:t xml:space="preserve"> — Missing No assessment/education subsystem in the prototype.</w:t>
-      </w:r>
-    </w:p>
-    <w:p>
-      <w:pPr>
-        <w:pStyle w:val="ListParagraph"/>
-        <w:numPr>
-          <w:ilvl w:val="0"/>
-          <w:numId w:val="1"/>
-        </w:numPr>
-        <w:spacing w:after="40"/>
-      </w:pPr>
-      <w:r>
-        <w:t xml:space="preserve">☐ </w:t>
-      </w:r>
-      <w:r>
-        <w:rPr>
-          <w:b/>
-          <w:bCs/>
-        </w:rPr>
-        <w:t xml:space="preserve">[085] 8.6.5 — Difficulty Estimation</w:t>
-      </w:r>
-      <w:r>
-        <w:t xml:space="preserve"> — Missing No assessment/education subsystem in the prototype.</w:t>
-      </w:r>
-    </w:p>
-    <w:p>
-      <w:pPr>
-        <w:pStyle w:val="ListParagraph"/>
-        <w:numPr>
-          <w:ilvl w:val="0"/>
-          <w:numId w:val="1"/>
-        </w:numPr>
-        <w:spacing w:after="40"/>
-      </w:pPr>
-      <w:r>
-        <w:t xml:space="preserve">☐ </w:t>
-      </w:r>
-      <w:r>
-        <w:rPr>
-          <w:b/>
-          <w:bCs/>
-        </w:rPr>
-        <w:t xml:space="preserve">[086] 8.6.6 — Error Type Classification</w:t>
-      </w:r>
-      <w:r>
-        <w:t xml:space="preserve"> — Missing No assessment/education subsystem in the prototype.</w:t>
-      </w:r>
-    </w:p>
-    <w:p>
-      <w:pPr>
-        <w:pStyle w:val="ListParagraph"/>
-        <w:numPr>
-          <w:ilvl w:val="0"/>
-          <w:numId w:val="1"/>
-        </w:numPr>
-        <w:spacing w:after="40"/>
-      </w:pPr>
-      <w:r>
-        <w:t xml:space="preserve">☐ </w:t>
-      </w:r>
-      <w:r>
-        <w:rPr>
-          <w:b/>
-          <w:bCs/>
-        </w:rPr>
-        <w:t xml:space="preserve">[087] 8.6.7 — Concept Path Mastery</w:t>
-      </w:r>
-      <w:r>
-        <w:t xml:space="preserve"> — Missing No assessment/education subsystem in the prototype.</w:t>
-      </w:r>
-    </w:p>
-    <w:p>
-      <w:pPr>
-        <w:pStyle w:val="ListParagraph"/>
-        <w:numPr>
-          <w:ilvl w:val="0"/>
-          <w:numId w:val="1"/>
-        </w:numPr>
-        <w:spacing w:after="40"/>
-      </w:pPr>
-      <w:r>
-        <w:t xml:space="preserve">☐ </w:t>
+        <w:t xml:space="preserve">☑ </w:t>
       </w:r>
       <w:r>
         <w:rPr>
@@ -2634,20 +2634,20 @@
         <w:t xml:space="preserve">[088] 8.6.8 — Assessment Provenance</w:t>
       </w:r>
       <w:r>
-        <w:t xml:space="preserve"> — Missing No assessment/education subsystem in the prototype.</w:t>
-      </w:r>
-    </w:p>
-    <w:p>
-      <w:pPr>
-        <w:pStyle w:val="ListParagraph"/>
-        <w:numPr>
-          <w:ilvl w:val="0"/>
-          <w:numId w:val="1"/>
-        </w:numPr>
-        <w:spacing w:after="40"/>
-      </w:pPr>
-      <w:r>
-        <w:t xml:space="preserve">☐ </w:t>
+        <w:t xml:space="preserve"> — Included — _qb_assess (provenance)_ Item provenance carried from Fact Units.</w:t>
+      </w:r>
+    </w:p>
+    <w:p>
+      <w:pPr>
+        <w:pStyle w:val="ListParagraph"/>
+        <w:numPr>
+          <w:ilvl w:val="0"/>
+          <w:numId w:val="1"/>
+        </w:numPr>
+        <w:spacing w:after="40"/>
+      </w:pPr>
+      <w:r>
+        <w:t xml:space="preserve">☑ </w:t>
       </w:r>
       <w:r>
         <w:rPr>
@@ -2657,7 +2657,7 @@
         <w:t xml:space="preserve">[089] 8.6.9 — FU Linked Item Generator</w:t>
       </w:r>
       <w:r>
-        <w:t xml:space="preserve"> — Missing No assessment/education subsystem in the prototype.</w:t>
+        <w:t xml:space="preserve"> — Included — _qb_assess.items_from_triples_ FU-linked item generator.</w:t>
       </w:r>
     </w:p>
     <w:p>
@@ -2827,20 +2827,20 @@
         <w:spacing w:after="90" w:before="220"/>
       </w:pPr>
       <w:r>
-        <w:t xml:space="preserve">7. Licensing &amp; Rights  (☑ 0 · ◐ 0 · ☐ 12 of 12)</w:t>
-      </w:r>
-    </w:p>
-    <w:p>
-      <w:pPr>
-        <w:pStyle w:val="ListParagraph"/>
-        <w:numPr>
-          <w:ilvl w:val="0"/>
-          <w:numId w:val="1"/>
-        </w:numPr>
-        <w:spacing w:after="40"/>
-      </w:pPr>
-      <w:r>
-        <w:t xml:space="preserve">☐ </w:t>
+        <w:t xml:space="preserve">7. Licensing &amp; Rights  (☑ 6 · ◐ 0 · ☐ 6 of 12)</w:t>
+      </w:r>
+    </w:p>
+    <w:p>
+      <w:pPr>
+        <w:pStyle w:val="ListParagraph"/>
+        <w:numPr>
+          <w:ilvl w:val="0"/>
+          <w:numId w:val="1"/>
+        </w:numPr>
+        <w:spacing w:after="40"/>
+      </w:pPr>
+      <w:r>
+        <w:t xml:space="preserve">☑ </w:t>
       </w:r>
       <w:r>
         <w:rPr>
@@ -2850,6 +2850,98 @@
         <w:t xml:space="preserve">[097] 8.7.1 — License Registry</w:t>
       </w:r>
       <w:r>
+        <w:t xml:space="preserve"> — Included — _qb_rights (registry)_ License registry.</w:t>
+      </w:r>
+    </w:p>
+    <w:p>
+      <w:pPr>
+        <w:pStyle w:val="ListParagraph"/>
+        <w:numPr>
+          <w:ilvl w:val="0"/>
+          <w:numId w:val="1"/>
+        </w:numPr>
+        <w:spacing w:after="40"/>
+      </w:pPr>
+      <w:r>
+        <w:t xml:space="preserve">☑ </w:t>
+      </w:r>
+      <w:r>
+        <w:rPr>
+          <w:b/>
+          <w:bCs/>
+        </w:rPr>
+        <w:t xml:space="preserve">[098] 8.7.2 — Rights Enforcement Engine</w:t>
+      </w:r>
+      <w:r>
+        <w:t xml:space="preserve"> — Included — _qb_rights.check_ Rights enforcement (allow/deny + reasons).</w:t>
+      </w:r>
+    </w:p>
+    <w:p>
+      <w:pPr>
+        <w:pStyle w:val="ListParagraph"/>
+        <w:numPr>
+          <w:ilvl w:val="0"/>
+          <w:numId w:val="1"/>
+        </w:numPr>
+        <w:spacing w:after="40"/>
+      </w:pPr>
+      <w:r>
+        <w:t xml:space="preserve">☑ </w:t>
+      </w:r>
+      <w:r>
+        <w:rPr>
+          <w:b/>
+          <w:bCs/>
+        </w:rPr>
+        <w:t xml:space="preserve">[099] 8.7.3 — Territorial Restrictions</w:t>
+      </w:r>
+      <w:r>
+        <w:t xml:space="preserve"> — Included — _qb_rights (territories)_ Territorial restrictions.</w:t>
+      </w:r>
+    </w:p>
+    <w:p>
+      <w:pPr>
+        <w:pStyle w:val="ListParagraph"/>
+        <w:numPr>
+          <w:ilvl w:val="0"/>
+          <w:numId w:val="1"/>
+        </w:numPr>
+        <w:spacing w:after="40"/>
+      </w:pPr>
+      <w:r>
+        <w:t xml:space="preserve">☑ </w:t>
+      </w:r>
+      <w:r>
+        <w:rPr>
+          <w:b/>
+          <w:bCs/>
+        </w:rPr>
+        <w:t xml:space="preserve">[100] 8.7.4 — Edition Restrictions Engine</w:t>
+      </w:r>
+      <w:r>
+        <w:t xml:space="preserve"> — Included — _qb_rights (editions)_ Edition restrictions.</w:t>
+      </w:r>
+    </w:p>
+    <w:p>
+      <w:pPr>
+        <w:pStyle w:val="ListParagraph"/>
+        <w:numPr>
+          <w:ilvl w:val="0"/>
+          <w:numId w:val="1"/>
+        </w:numPr>
+        <w:spacing w:after="40"/>
+      </w:pPr>
+      <w:r>
+        <w:t xml:space="preserve">☐ </w:t>
+      </w:r>
+      <w:r>
+        <w:rPr>
+          <w:b/>
+          <w:bCs/>
+        </w:rPr>
+        <w:t xml:space="preserve">[101] 8.7.5 — NFT Based Licensing</w:t>
+      </w:r>
+      <w:r>
         <w:t xml:space="preserve"> — Missing No licensing/rights subsystem in the prototype.</w:t>
       </w:r>
     </w:p>
@@ -2870,7 +2962,7 @@
           <w:b/>
           <w:bCs/>
         </w:rPr>
-        <w:t xml:space="preserve">[098] 8.7.2 — Rights Enforcement Engine</w:t>
+        <w:t xml:space="preserve">[102] 8.7.6 — Institutional Override</w:t>
       </w:r>
       <w:r>
         <w:t xml:space="preserve"> — Missing No licensing/rights subsystem in the prototype.</w:t>
@@ -2893,7 +2985,7 @@
           <w:b/>
           <w:bCs/>
         </w:rPr>
-        <w:t xml:space="preserve">[099] 8.7.3 — Territorial Restrictions</w:t>
+        <w:t xml:space="preserve">[103] 8.7.7 — Rights Aware Logging</w:t>
       </w:r>
       <w:r>
         <w:t xml:space="preserve"> — Missing No licensing/rights subsystem in the prototype.</w:t>
@@ -2909,14 +3001,37 @@
         <w:spacing w:after="40"/>
       </w:pPr>
       <w:r>
-        <w:t xml:space="preserve">☐ </w:t>
-      </w:r>
-      <w:r>
-        <w:rPr>
-          <w:b/>
-          <w:bCs/>
-        </w:rPr>
-        <w:t xml:space="preserve">[100] 8.7.4 — Edition Restrictions Engine</w:t>
+        <w:t xml:space="preserve">☑ </w:t>
+      </w:r>
+      <w:r>
+        <w:rPr>
+          <w:b/>
+          <w:bCs/>
+        </w:rPr>
+        <w:t xml:space="preserve">[104] 8.7.8 — License Expiration Handler</w:t>
+      </w:r>
+      <w:r>
+        <w:t xml:space="preserve"> — Included — _qb_rights (expires)_ License expiration handling.</w:t>
+      </w:r>
+    </w:p>
+    <w:p>
+      <w:pPr>
+        <w:pStyle w:val="ListParagraph"/>
+        <w:numPr>
+          <w:ilvl w:val="0"/>
+          <w:numId w:val="1"/>
+        </w:numPr>
+        <w:spacing w:after="40"/>
+      </w:pPr>
+      <w:r>
+        <w:t xml:space="preserve">☐ </w:t>
+      </w:r>
+      <w:r>
+        <w:rPr>
+          <w:b/>
+          <w:bCs/>
+        </w:rPr>
+        <w:t xml:space="preserve">[105] 8.7.9 — Rights Event Hooks</w:t>
       </w:r>
       <w:r>
         <w:t xml:space="preserve"> — Missing No licensing/rights subsystem in the prototype.</w:t>
@@ -2939,7 +3054,7 @@
           <w:b/>
           <w:bCs/>
         </w:rPr>
-        <w:t xml:space="preserve">[101] 8.7.5 — NFT Based Licensing</w:t>
+        <w:t xml:space="preserve">[106] 8.7.10 — BCLQ Integration Layer</w:t>
       </w:r>
       <w:r>
         <w:t xml:space="preserve"> — Missing No licensing/rights subsystem in the prototype.</w:t>
@@ -2955,122 +3070,7 @@
         <w:spacing w:after="40"/>
       </w:pPr>
       <w:r>
-        <w:t xml:space="preserve">☐ </w:t>
-      </w:r>
-      <w:r>
-        <w:rPr>
-          <w:b/>
-          <w:bCs/>
-        </w:rPr>
-        <w:t xml:space="preserve">[102] 8.7.6 — Institutional Override</w:t>
-      </w:r>
-      <w:r>
-        <w:t xml:space="preserve"> — Missing No licensing/rights subsystem in the prototype.</w:t>
-      </w:r>
-    </w:p>
-    <w:p>
-      <w:pPr>
-        <w:pStyle w:val="ListParagraph"/>
-        <w:numPr>
-          <w:ilvl w:val="0"/>
-          <w:numId w:val="1"/>
-        </w:numPr>
-        <w:spacing w:after="40"/>
-      </w:pPr>
-      <w:r>
-        <w:t xml:space="preserve">☐ </w:t>
-      </w:r>
-      <w:r>
-        <w:rPr>
-          <w:b/>
-          <w:bCs/>
-        </w:rPr>
-        <w:t xml:space="preserve">[103] 8.7.7 — Rights Aware Logging</w:t>
-      </w:r>
-      <w:r>
-        <w:t xml:space="preserve"> — Missing No licensing/rights subsystem in the prototype.</w:t>
-      </w:r>
-    </w:p>
-    <w:p>
-      <w:pPr>
-        <w:pStyle w:val="ListParagraph"/>
-        <w:numPr>
-          <w:ilvl w:val="0"/>
-          <w:numId w:val="1"/>
-        </w:numPr>
-        <w:spacing w:after="40"/>
-      </w:pPr>
-      <w:r>
-        <w:t xml:space="preserve">☐ </w:t>
-      </w:r>
-      <w:r>
-        <w:rPr>
-          <w:b/>
-          <w:bCs/>
-        </w:rPr>
-        <w:t xml:space="preserve">[104] 8.7.8 — License Expiration Handler</w:t>
-      </w:r>
-      <w:r>
-        <w:t xml:space="preserve"> — Missing No licensing/rights subsystem in the prototype.</w:t>
-      </w:r>
-    </w:p>
-    <w:p>
-      <w:pPr>
-        <w:pStyle w:val="ListParagraph"/>
-        <w:numPr>
-          <w:ilvl w:val="0"/>
-          <w:numId w:val="1"/>
-        </w:numPr>
-        <w:spacing w:after="40"/>
-      </w:pPr>
-      <w:r>
-        <w:t xml:space="preserve">☐ </w:t>
-      </w:r>
-      <w:r>
-        <w:rPr>
-          <w:b/>
-          <w:bCs/>
-        </w:rPr>
-        <w:t xml:space="preserve">[105] 8.7.9 — Rights Event Hooks</w:t>
-      </w:r>
-      <w:r>
-        <w:t xml:space="preserve"> — Missing No licensing/rights subsystem in the prototype.</w:t>
-      </w:r>
-    </w:p>
-    <w:p>
-      <w:pPr>
-        <w:pStyle w:val="ListParagraph"/>
-        <w:numPr>
-          <w:ilvl w:val="0"/>
-          <w:numId w:val="1"/>
-        </w:numPr>
-        <w:spacing w:after="40"/>
-      </w:pPr>
-      <w:r>
-        <w:t xml:space="preserve">☐ </w:t>
-      </w:r>
-      <w:r>
-        <w:rPr>
-          <w:b/>
-          <w:bCs/>
-        </w:rPr>
-        <w:t xml:space="preserve">[106] 8.7.10 — BCLQ Integration Layer</w:t>
-      </w:r>
-      <w:r>
-        <w:t xml:space="preserve"> — Missing No licensing/rights subsystem in the prototype.</w:t>
-      </w:r>
-    </w:p>
-    <w:p>
-      <w:pPr>
-        <w:pStyle w:val="ListParagraph"/>
-        <w:numPr>
-          <w:ilvl w:val="0"/>
-          <w:numId w:val="1"/>
-        </w:numPr>
-        <w:spacing w:after="40"/>
-      </w:pPr>
-      <w:r>
-        <w:t xml:space="preserve">☐ </w:t>
+        <w:t xml:space="preserve">☑ </w:t>
       </w:r>
       <w:r>
         <w:rPr>
@@ -3080,7 +3080,7 @@
         <w:t xml:space="preserve">[107] 8.7.11 — License Scope Resolver</w:t>
       </w:r>
       <w:r>
-        <w:t xml:space="preserve"> — Missing No licensing/rights subsystem in the prototype.</w:t>
+        <w:t xml:space="preserve"> — Included — _qb_rights.check (scope)_ License scope resolver.</w:t>
       </w:r>
     </w:p>
     <w:p>
@@ -3112,7 +3112,7 @@
         <w:spacing w:after="90" w:before="220"/>
       </w:pPr>
       <w:r>
-        <w:t xml:space="preserve">8. NFT / Blockchain  (☑ 0 · ◐ 0 · ☐ 10 of 10)</w:t>
+        <w:t xml:space="preserve">8. NFT / Blockchain  (☑ 2 · ◐ 1 · ☐ 7 of 10)</w:t>
       </w:r>
     </w:p>
     <w:p>
@@ -3171,7 +3171,7 @@
         <w:spacing w:after="40"/>
       </w:pPr>
       <w:r>
-        <w:t xml:space="preserve">☐ </w:t>
+        <w:t xml:space="preserve">◐ </w:t>
       </w:r>
       <w:r>
         <w:rPr>
@@ -3181,6 +3181,29 @@
         <w:t xml:space="preserve">[111] 8.8.3 — Provenance NFT Engine</w:t>
       </w:r>
       <w:r>
+        <w:t xml:space="preserve"> — Partial — _qb_integrity (hash-chain ledger)_ Local tamper-evident provenance; NOT on-chain NFT.</w:t>
+      </w:r>
+    </w:p>
+    <w:p>
+      <w:pPr>
+        <w:pStyle w:val="ListParagraph"/>
+        <w:numPr>
+          <w:ilvl w:val="0"/>
+          <w:numId w:val="1"/>
+        </w:numPr>
+        <w:spacing w:after="40"/>
+      </w:pPr>
+      <w:r>
+        <w:t xml:space="preserve">☐ </w:t>
+      </w:r>
+      <w:r>
+        <w:rPr>
+          <w:b/>
+          <w:bCs/>
+        </w:rPr>
+        <w:t xml:space="preserve">[112] 8.8.4 — Response NFT Engine</w:t>
+      </w:r>
+      <w:r>
         <w:t xml:space="preserve"> — Missing No NFT/blockchain minting in the prototype (provenance is SHA-256 Fact Units, not on-chain).</w:t>
       </w:r>
     </w:p>
@@ -3194,30 +3217,7 @@
         <w:spacing w:after="40"/>
       </w:pPr>
       <w:r>
-        <w:t xml:space="preserve">☐ </w:t>
-      </w:r>
-      <w:r>
-        <w:rPr>
-          <w:b/>
-          <w:bCs/>
-        </w:rPr>
-        <w:t xml:space="preserve">[112] 8.8.4 — Response NFT Engine</w:t>
-      </w:r>
-      <w:r>
-        <w:t xml:space="preserve"> — Missing No NFT/blockchain minting in the prototype (provenance is SHA-256 Fact Units, not on-chain).</w:t>
-      </w:r>
-    </w:p>
-    <w:p>
-      <w:pPr>
-        <w:pStyle w:val="ListParagraph"/>
-        <w:numPr>
-          <w:ilvl w:val="0"/>
-          <w:numId w:val="1"/>
-        </w:numPr>
-        <w:spacing w:after="40"/>
-      </w:pPr>
-      <w:r>
-        <w:t xml:space="preserve">☐ </w:t>
+        <w:t xml:space="preserve">☑ </w:t>
       </w:r>
       <w:r>
         <w:rPr>
@@ -3227,20 +3227,20 @@
         <w:t xml:space="preserve">[113] 8.8.5 — Lineage Chain Manager</w:t>
       </w:r>
       <w:r>
-        <w:t xml:space="preserve"> — Missing No NFT/blockchain minting in the prototype (provenance is SHA-256 Fact Units, not on-chain).</w:t>
-      </w:r>
-    </w:p>
-    <w:p>
-      <w:pPr>
-        <w:pStyle w:val="ListParagraph"/>
-        <w:numPr>
-          <w:ilvl w:val="0"/>
-          <w:numId w:val="1"/>
-        </w:numPr>
-        <w:spacing w:after="40"/>
-      </w:pPr>
-      <w:r>
-        <w:t xml:space="preserve">☐ </w:t>
+        <w:t xml:space="preserve"> — Included — _qb_integrity.lineage_ Lineage chain manager (local hash chain).</w:t>
+      </w:r>
+    </w:p>
+    <w:p>
+      <w:pPr>
+        <w:pStyle w:val="ListParagraph"/>
+        <w:numPr>
+          <w:ilvl w:val="0"/>
+          <w:numId w:val="1"/>
+        </w:numPr>
+        <w:spacing w:after="40"/>
+      </w:pPr>
+      <w:r>
+        <w:t xml:space="preserve">☑ </w:t>
       </w:r>
       <w:r>
         <w:rPr>
@@ -3250,7 +3250,7 @@
         <w:t xml:space="preserve">[114] 8.8.6 — Ownership Verification</w:t>
       </w:r>
       <w:r>
-        <w:t xml:space="preserve"> — Missing No NFT/blockchain minting in the prototype (provenance is SHA-256 Fact Units, not on-chain).</w:t>
+        <w:t xml:space="preserve"> — Included — _qb_integrity.verify_chain_ Ownership/integrity verification (local).</w:t>
       </w:r>
     </w:p>
     <w:p>
@@ -3351,7 +3351,7 @@
         <w:spacing w:after="90" w:before="220"/>
       </w:pPr>
       <w:r>
-        <w:t xml:space="preserve">9. Reader Experience  (☑ 0 · ◐ 1 · ☐ 11 of 12)</w:t>
+        <w:t xml:space="preserve">9. Reader Experience  (☑ 1 · ◐ 1 · ☐ 10 of 12)</w:t>
       </w:r>
     </w:p>
     <w:p>
@@ -3571,7 +3571,7 @@
         <w:spacing w:after="40"/>
       </w:pPr>
       <w:r>
-        <w:t xml:space="preserve">☐ </w:t>
+        <w:t xml:space="preserve">☑ </w:t>
       </w:r>
       <w:r>
         <w:rPr>
@@ -3581,7 +3581,7 @@
         <w:t xml:space="preserve">[128] 8.9.10 — Study Guide Generator</w:t>
       </w:r>
       <w:r>
-        <w:t xml:space="preserve"> — Missing No reader-experience subsystem in the prototype.</w:t>
+        <w:t xml:space="preserve"> — Included — _qb_assess.study_guide_ Study-guide generator.</w:t>
       </w:r>
     </w:p>
     <w:p>
@@ -4229,7 +4229,7 @@
         <w:spacing w:after="90" w:before="220"/>
       </w:pPr>
       <w:r>
-        <w:t xml:space="preserve">12. Response Generation  (☑ 3 · ◐ 6 · ☐ 1 of 10)</w:t>
+        <w:t xml:space="preserve">12. Response Generation  (☑ 6 · ◐ 3 · ☐ 1 of 10)</w:t>
       </w:r>
     </w:p>
     <w:p>
@@ -4334,6 +4334,52 @@
         <w:spacing w:after="40"/>
       </w:pPr>
       <w:r>
+        <w:t xml:space="preserve">☑ </w:t>
+      </w:r>
+      <w:r>
+        <w:rPr>
+          <w:b/>
+          <w:bCs/>
+        </w:rPr>
+        <w:t xml:space="preserve">[160] 8.12.5 — Response Ranking Engine</w:t>
+      </w:r>
+      <w:r>
+        <w:t xml:space="preserve"> — Included — _qb_query.rank_evidence_ Lexical-overlap evidence ranking.</w:t>
+      </w:r>
+    </w:p>
+    <w:p>
+      <w:pPr>
+        <w:pStyle w:val="ListParagraph"/>
+        <w:numPr>
+          <w:ilvl w:val="0"/>
+          <w:numId w:val="1"/>
+        </w:numPr>
+        <w:spacing w:after="40"/>
+      </w:pPr>
+      <w:r>
+        <w:t xml:space="preserve">☑ </w:t>
+      </w:r>
+      <w:r>
+        <w:rPr>
+          <w:b/>
+          <w:bCs/>
+        </w:rPr>
+        <w:t xml:space="preserve">[161] 8.12.6 — Response Coherence</w:t>
+      </w:r>
+      <w:r>
+        <w:t xml:space="preserve"> — Included — _qb_query.rank_evidence (coherence)_ Coherence flag on ranked evidence.</w:t>
+      </w:r>
+    </w:p>
+    <w:p>
+      <w:pPr>
+        <w:pStyle w:val="ListParagraph"/>
+        <w:numPr>
+          <w:ilvl w:val="0"/>
+          <w:numId w:val="1"/>
+        </w:numPr>
+        <w:spacing w:after="40"/>
+      </w:pPr>
+      <w:r>
         <w:t xml:space="preserve">◐ </w:t>
       </w:r>
       <w:r>
@@ -4341,52 +4387,6 @@
           <w:b/>
           <w:bCs/>
         </w:rPr>
-        <w:t xml:space="preserve">[160] 8.12.5 — Response Ranking Engine</w:t>
-      </w:r>
-      <w:r>
-        <w:t xml:space="preserve"> — Partial — _qb_chat.retrieve (ranking)_ Retrieved evidence is ranked; no dedicated ranking engine.</w:t>
-      </w:r>
-    </w:p>
-    <w:p>
-      <w:pPr>
-        <w:pStyle w:val="ListParagraph"/>
-        <w:numPr>
-          <w:ilvl w:val="0"/>
-          <w:numId w:val="1"/>
-        </w:numPr>
-        <w:spacing w:after="40"/>
-      </w:pPr>
-      <w:r>
-        <w:t xml:space="preserve">◐ </w:t>
-      </w:r>
-      <w:r>
-        <w:rPr>
-          <w:b/>
-          <w:bCs/>
-        </w:rPr>
-        <w:t xml:space="preserve">[161] 8.12.6 — Response Coherence</w:t>
-      </w:r>
-      <w:r>
-        <w:t xml:space="preserve"> — Partial — _qb_chat.compose/check_ Coherence check exists in compose/check.</w:t>
-      </w:r>
-    </w:p>
-    <w:p>
-      <w:pPr>
-        <w:pStyle w:val="ListParagraph"/>
-        <w:numPr>
-          <w:ilvl w:val="0"/>
-          <w:numId w:val="1"/>
-        </w:numPr>
-        <w:spacing w:after="40"/>
-      </w:pPr>
-      <w:r>
-        <w:t xml:space="preserve">◐ </w:t>
-      </w:r>
-      <w:r>
-        <w:rPr>
-          <w:b/>
-          <w:bCs/>
-        </w:rPr>
         <w:t xml:space="preserve">[162] 8.12.7 — Multi Hop Reasoning</w:t>
       </w:r>
       <w:r>
@@ -4403,7 +4403,7 @@
         <w:spacing w:after="40"/>
       </w:pPr>
       <w:r>
-        <w:t xml:space="preserve">◐ </w:t>
+        <w:t xml:space="preserve">☑ </w:t>
       </w:r>
       <w:r>
         <w:rPr>
@@ -4413,7 +4413,7 @@
         <w:t xml:space="preserve">[163] 8.12.8 — Rights Aware Redaction</w:t>
       </w:r>
       <w:r>
-        <w:t xml:space="preserve"> — Partial — _qb_chat_ Partially realized by the chat answer pipeline.</w:t>
+        <w:t xml:space="preserve"> — Included — _qb_rights.redact_ Rights-aware redaction.</w:t>
       </w:r>
     </w:p>
     <w:p>
@@ -4638,7 +4638,7 @@
         <w:spacing w:after="90" w:before="220"/>
       </w:pPr>
       <w:r>
-        <w:t xml:space="preserve">14. Deployment &amp; Integration  (☑ 0 · ◐ 4 · ☐ 1 of 5)</w:t>
+        <w:t xml:space="preserve">14. Deployment &amp; Integration  (☑ 1 · ◐ 4 · ☐ 0 of 5)</w:t>
       </w:r>
     </w:p>
     <w:p>
@@ -4743,7 +4743,7 @@
         <w:spacing w:after="40"/>
       </w:pPr>
       <w:r>
-        <w:t xml:space="preserve">☐ </w:t>
+        <w:t xml:space="preserve">☑ </w:t>
       </w:r>
       <w:r>
         <w:rPr>
@@ -4753,7 +4753,7 @@
         <w:t xml:space="preserve">[177] 8.15.3 — Webhooks and Event</w:t>
       </w:r>
       <w:r>
-        <w:t xml:space="preserve"> — Missing No webhooks/event-subscription system.</w:t>
+        <w:t xml:space="preserve"> — Included — _/api/webhooks_ Webhook registry (register/list/clear).</w:t>
       </w:r>
     </w:p>
     <w:p>
@@ -5263,7 +5263,30 @@
         <w:spacing w:after="90" w:before="220"/>
       </w:pPr>
       <w:r>
-        <w:t xml:space="preserve">17. LIL Identity / Voiceprint  (☑ 0 · ◐ 3 · ☐ 2 of 5)</w:t>
+        <w:t xml:space="preserve">17. LIL Identity / Voiceprint  (☑ 3 · ◐ 2 · ☐ 0 of 5)</w:t>
+      </w:r>
+    </w:p>
+    <w:p>
+      <w:pPr>
+        <w:pStyle w:val="ListParagraph"/>
+        <w:numPr>
+          <w:ilvl w:val="0"/>
+          <w:numId w:val="1"/>
+        </w:numPr>
+        <w:spacing w:after="40"/>
+      </w:pPr>
+      <w:r>
+        <w:t xml:space="preserve">☑ </w:t>
+      </w:r>
+      <w:r>
+        <w:rPr>
+          <w:b/>
+          <w:bCs/>
+        </w:rPr>
+        <w:t xml:space="preserve">[199] 19.1 - LIL voiceprint engine  [SPEC]</w:t>
+      </w:r>
+      <w:r>
+        <w:t xml:space="preserve"> — Included — _qb_lil (enroll/match)_ Voiceprint engine backend (deterministic, consent-gated).</w:t>
       </w:r>
     </w:p>
     <w:p>
@@ -5283,33 +5306,33 @@
           <w:b/>
           <w:bCs/>
         </w:rPr>
-        <w:t xml:space="preserve">[199] 19.1 - LIL voiceprint engine  [SPEC]</w:t>
-      </w:r>
-      <w:r>
-        <w:t xml:space="preserve"> — Partial — _voice.html (Voice Lab)_ Voiceprint record/profile/match exists as a browser demo; no engine backend or persistent identity store.</w:t>
-      </w:r>
-    </w:p>
-    <w:p>
-      <w:pPr>
-        <w:pStyle w:val="ListParagraph"/>
-        <w:numPr>
-          <w:ilvl w:val="0"/>
-          <w:numId w:val="1"/>
-        </w:numPr>
-        <w:spacing w:after="40"/>
-      </w:pPr>
-      <w:r>
-        <w:t xml:space="preserve">☐ </w:t>
-      </w:r>
-      <w:r>
-        <w:rPr>
-          <w:b/>
-          <w:bCs/>
-        </w:rPr>
         <w:t xml:space="preserve">[200] 19.2 - Fact-Unit identity graph (voice/face/entities)  [SPEC]</w:t>
       </w:r>
       <w:r>
-        <w:t xml:space="preserve"> — Missing — _voice.html_ Design only / browser demo; no engine backend.</w:t>
+        <w:t xml:space="preserve"> — Partial — _qb_lil (identity fields)_ Links name/email/venue; full FU identity graph pending.</w:t>
+      </w:r>
+    </w:p>
+    <w:p>
+      <w:pPr>
+        <w:pStyle w:val="ListParagraph"/>
+        <w:numPr>
+          <w:ilvl w:val="0"/>
+          <w:numId w:val="1"/>
+        </w:numPr>
+        <w:spacing w:after="40"/>
+      </w:pPr>
+      <w:r>
+        <w:t xml:space="preserve">☑ </w:t>
+      </w:r>
+      <w:r>
+        <w:rPr>
+          <w:b/>
+          <w:bCs/>
+        </w:rPr>
+        <w:t xml:space="preserve">[201] 19.3 - Trust-gated identity assertion (covenant)  [SPEC]</w:t>
+      </w:r>
+      <w:r>
+        <w:t xml:space="preserve"> — Included — _qb_lil + consent gate_ Trust/consent-gated identity assertion (attributed).</w:t>
       </w:r>
     </w:p>
     <w:p>
@@ -5329,46 +5352,23 @@
           <w:b/>
           <w:bCs/>
         </w:rPr>
-        <w:t xml:space="preserve">[201] 19.3 - Trust-gated identity assertion (covenant)  [SPEC]</w:t>
-      </w:r>
-      <w:r>
-        <w:t xml:space="preserve"> — Partial — _voice.html consent + qb_language custom-voice consent gate_ Trust/consent gating is present in UI and for voice cloning; no identity-assertion engine.</w:t>
-      </w:r>
-    </w:p>
-    <w:p>
-      <w:pPr>
-        <w:pStyle w:val="ListParagraph"/>
-        <w:numPr>
-          <w:ilvl w:val="0"/>
-          <w:numId w:val="1"/>
-        </w:numPr>
-        <w:spacing w:after="40"/>
-      </w:pPr>
-      <w:r>
-        <w:t xml:space="preserve">☐ </w:t>
-      </w:r>
-      <w:r>
-        <w:rPr>
-          <w:b/>
-          <w:bCs/>
-        </w:rPr>
         <w:t xml:space="preserve">[202] 19.4 - Voice authentication + anti-spoofing  [SPEC]</w:t>
       </w:r>
       <w:r>
-        <w:t xml:space="preserve"> — Missing — _voice.html_ Design only / browser demo; no engine backend.</w:t>
-      </w:r>
-    </w:p>
-    <w:p>
-      <w:pPr>
-        <w:pStyle w:val="ListParagraph"/>
-        <w:numPr>
-          <w:ilvl w:val="0"/>
-          <w:numId w:val="1"/>
-        </w:numPr>
-        <w:spacing w:after="40"/>
-      </w:pPr>
-      <w:r>
-        <w:t xml:space="preserve">◐ </w:t>
+        <w:t xml:space="preserve"> — Partial — _qb_lil.authenticate_ Voice auth built; anti-spoofing not implemented (labelled).</w:t>
+      </w:r>
+    </w:p>
+    <w:p>
+      <w:pPr>
+        <w:pStyle w:val="ListParagraph"/>
+        <w:numPr>
+          <w:ilvl w:val="0"/>
+          <w:numId w:val="1"/>
+        </w:numPr>
+        <w:spacing w:after="40"/>
+      </w:pPr>
+      <w:r>
+        <w:t xml:space="preserve">☑ </w:t>
       </w:r>
       <w:r>
         <w:rPr>
@@ -5378,7 +5378,7 @@
         <w:t xml:space="preserve">[203] 19.5 - Consent gate + biometric privacy  [SPEC]</w:t>
       </w:r>
       <w:r>
-        <w:t xml:space="preserve"> — Partial — _voice.html vp-consent, qb_language.google_build_custom_voice (consent gate)_ Consent gate enforced for voiceprints (UI) and voice cloning (engine).</w:t>
+        <w:t xml:space="preserve"> — Included — _qb_lil (consent) _ Consent gate + local biometric privacy.</w:t>
       </w:r>
     </w:p>
     <w:p>
@@ -5387,20 +5387,20 @@
         <w:spacing w:after="90" w:before="220"/>
       </w:pPr>
       <w:r>
-        <w:t xml:space="preserve">18. UIAS Integrity Audit  (☑ 0 · ◐ 0 · ☐ 6 of 6)</w:t>
-      </w:r>
-    </w:p>
-    <w:p>
-      <w:pPr>
-        <w:pStyle w:val="ListParagraph"/>
-        <w:numPr>
-          <w:ilvl w:val="0"/>
-          <w:numId w:val="1"/>
-        </w:numPr>
-        <w:spacing w:after="40"/>
-      </w:pPr>
-      <w:r>
-        <w:t xml:space="preserve">☐ </w:t>
+        <w:t xml:space="preserve">18. UIAS Integrity Audit  (☑ 3 · ◐ 0 · ☐ 3 of 6)</w:t>
+      </w:r>
+    </w:p>
+    <w:p>
+      <w:pPr>
+        <w:pStyle w:val="ListParagraph"/>
+        <w:numPr>
+          <w:ilvl w:val="0"/>
+          <w:numId w:val="1"/>
+        </w:numPr>
+        <w:spacing w:after="40"/>
+      </w:pPr>
+      <w:r>
+        <w:t xml:space="preserve">☑ </w:t>
       </w:r>
       <w:r>
         <w:rPr>
@@ -5410,20 +5410,20 @@
         <w:t xml:space="preserve">[204] 20.1 - UIAS pre-dispute sealing (seal = Fact Unit)  [SPEC]</w:t>
       </w:r>
       <w:r>
-        <w:t xml:space="preserve"> — Missing Design only; no prototype implementation.</w:t>
-      </w:r>
-    </w:p>
-    <w:p>
-      <w:pPr>
-        <w:pStyle w:val="ListParagraph"/>
-        <w:numPr>
-          <w:ilvl w:val="0"/>
-          <w:numId w:val="1"/>
-        </w:numPr>
-        <w:spacing w:after="40"/>
-      </w:pPr>
-      <w:r>
-        <w:t xml:space="preserve">☐ </w:t>
+        <w:t xml:space="preserve"> — Included — _qb_integrity.seal_ Pre-dispute timestamped seal (seal = Fact Unit).</w:t>
+      </w:r>
+    </w:p>
+    <w:p>
+      <w:pPr>
+        <w:pStyle w:val="ListParagraph"/>
+        <w:numPr>
+          <w:ilvl w:val="0"/>
+          <w:numId w:val="1"/>
+        </w:numPr>
+        <w:spacing w:after="40"/>
+      </w:pPr>
+      <w:r>
+        <w:t xml:space="preserve">☑ </w:t>
       </w:r>
       <w:r>
         <w:rPr>
@@ -5433,20 +5433,20 @@
         <w:t xml:space="preserve">[205] 20.2 - Real-time cross-submission similarity detection  [SPEC]</w:t>
       </w:r>
       <w:r>
-        <w:t xml:space="preserve"> — Missing Design only; no prototype implementation.</w:t>
-      </w:r>
-    </w:p>
-    <w:p>
-      <w:pPr>
-        <w:pStyle w:val="ListParagraph"/>
-        <w:numPr>
-          <w:ilvl w:val="0"/>
-          <w:numId w:val="1"/>
-        </w:numPr>
-        <w:spacing w:after="40"/>
-      </w:pPr>
-      <w:r>
-        <w:t xml:space="preserve">☐ </w:t>
+        <w:t xml:space="preserve"> — Included — _qb_integrity.similarity_ Cross-submission k-shingle Jaccard similarity.</w:t>
+      </w:r>
+    </w:p>
+    <w:p>
+      <w:pPr>
+        <w:pStyle w:val="ListParagraph"/>
+        <w:numPr>
+          <w:ilvl w:val="0"/>
+          <w:numId w:val="1"/>
+        </w:numPr>
+        <w:spacing w:after="40"/>
+      </w:pPr>
+      <w:r>
+        <w:t xml:space="preserve">☑ </w:t>
       </w:r>
       <w:r>
         <w:rPr>
@@ -5456,7 +5456,7 @@
         <w:t xml:space="preserve">[206] 20.3 - Signed Proof Package generation  [SPEC]</w:t>
       </w:r>
       <w:r>
-        <w:t xml:space="preserve"> — Missing Design only; no prototype implementation.</w:t>
+        <w:t xml:space="preserve"> — Included — _qb_integrity.proof_package_ HMAC-signed proof package (local).</w:t>
       </w:r>
     </w:p>
     <w:p>
@@ -5534,20 +5534,20 @@
         <w:spacing w:after="90" w:before="220"/>
       </w:pPr>
       <w:r>
-        <w:t xml:space="preserve">19. PIL Interpretation  (☑ 1 · ◐ 1 · ☐ 3 of 5)</w:t>
-      </w:r>
-    </w:p>
-    <w:p>
-      <w:pPr>
-        <w:pStyle w:val="ListParagraph"/>
-        <w:numPr>
-          <w:ilvl w:val="0"/>
-          <w:numId w:val="1"/>
-        </w:numPr>
-        <w:spacing w:after="40"/>
-      </w:pPr>
-      <w:r>
-        <w:t xml:space="preserve">◐ </w:t>
+        <w:t xml:space="preserve">19. PIL Interpretation  (☑ 4 · ◐ 0 · ☐ 1 of 5)</w:t>
+      </w:r>
+    </w:p>
+    <w:p>
+      <w:pPr>
+        <w:pStyle w:val="ListParagraph"/>
+        <w:numPr>
+          <w:ilvl w:val="0"/>
+          <w:numId w:val="1"/>
+        </w:numPr>
+        <w:spacing w:after="40"/>
+      </w:pPr>
+      <w:r>
+        <w:t xml:space="preserve">☑ </w:t>
       </w:r>
       <w:r>
         <w:rPr>
@@ -5557,20 +5557,20 @@
         <w:t xml:space="preserve">[210] 21.1 - Paralinguistic analysis (measured estimates)  [PARTIAL: acoustic BUILT]</w:t>
       </w:r>
       <w:r>
-        <w:t xml:space="preserve"> — Partial — _voice.html (tone/arousal/pacing demo)_ Paralinguistic acoustic estimates exist as a browser demo; no engine backend.</w:t>
-      </w:r>
-    </w:p>
-    <w:p>
-      <w:pPr>
-        <w:pStyle w:val="ListParagraph"/>
-        <w:numPr>
-          <w:ilvl w:val="0"/>
-          <w:numId w:val="1"/>
-        </w:numPr>
-        <w:spacing w:after="40"/>
-      </w:pPr>
-      <w:r>
-        <w:t xml:space="preserve">☐ </w:t>
+        <w:t xml:space="preserve"> — Included — _qb_pil.analyze_ Paralinguistic measured estimates backend.</w:t>
+      </w:r>
+    </w:p>
+    <w:p>
+      <w:pPr>
+        <w:pStyle w:val="ListParagraph"/>
+        <w:numPr>
+          <w:ilvl w:val="0"/>
+          <w:numId w:val="1"/>
+        </w:numPr>
+        <w:spacing w:after="40"/>
+      </w:pPr>
+      <w:r>
+        <w:t xml:space="preserve">☑ </w:t>
       </w:r>
       <w:r>
         <w:rPr>
@@ -5580,6 +5580,29 @@
         <w:t xml:space="preserve">[211] 21.2 - Pragmatic framing (sourced)  [SPEC]</w:t>
       </w:r>
       <w:r>
+        <w:t xml:space="preserve"> — Included — _qb_pil.pragmatics_ Pragmatic framing (sourced cues).</w:t>
+      </w:r>
+    </w:p>
+    <w:p>
+      <w:pPr>
+        <w:pStyle w:val="ListParagraph"/>
+        <w:numPr>
+          <w:ilvl w:val="0"/>
+          <w:numId w:val="1"/>
+        </w:numPr>
+        <w:spacing w:after="40"/>
+      </w:pPr>
+      <w:r>
+        <w:t xml:space="preserve">☐ </w:t>
+      </w:r>
+      <w:r>
+        <w:rPr>
+          <w:b/>
+          <w:bCs/>
+        </w:rPr>
+        <w:t xml:space="preserve">[212] 21.3 - Interpretation Frame (Fact Units)  [SPEC]</w:t>
+      </w:r>
+      <w:r>
         <w:t xml:space="preserve"> — Missing Design only; no prototype implementation.</w:t>
       </w:r>
     </w:p>
@@ -5593,30 +5616,7 @@
         <w:spacing w:after="40"/>
       </w:pPr>
       <w:r>
-        <w:t xml:space="preserve">☐ </w:t>
-      </w:r>
-      <w:r>
-        <w:rPr>
-          <w:b/>
-          <w:bCs/>
-        </w:rPr>
-        <w:t xml:space="preserve">[212] 21.3 - Interpretation Frame (Fact Units)  [SPEC]</w:t>
-      </w:r>
-      <w:r>
-        <w:t xml:space="preserve"> — Missing Design only; no prototype implementation.</w:t>
-      </w:r>
-    </w:p>
-    <w:p>
-      <w:pPr>
-        <w:pStyle w:val="ListParagraph"/>
-        <w:numPr>
-          <w:ilvl w:val="0"/>
-          <w:numId w:val="1"/>
-        </w:numPr>
-        <w:spacing w:after="40"/>
-      </w:pPr>
-      <w:r>
-        <w:t xml:space="preserve">☐ </w:t>
+        <w:t xml:space="preserve">☑ </w:t>
       </w:r>
       <w:r>
         <w:rPr>
@@ -5626,7 +5626,7 @@
         <w:t xml:space="preserve">[213] 21.4 - Query interpretation front stage  [SPEC]</w:t>
       </w:r>
       <w:r>
-        <w:t xml:space="preserve"> — Missing Design only; no prototype implementation.</w:t>
+        <w:t xml:space="preserve"> — Included — _qb_pil.interpret_query + qb_query_ Query interpretation front stage.</w:t>
       </w:r>
     </w:p>
     <w:p>

</xml_diff>